<commit_message>
fix: add steps to fast_exp
</commit_message>
<xml_diff>
--- a/Algorithms.docx
+++ b/Algorithms.docx
@@ -401,82 +401,18 @@
                 <w:rFonts w:ascii="Times New Roman" w:hAnsi="Times New Roman" w:cs="Times New Roman"/>
                 <w:sz w:val="28"/>
                 <w:szCs w:val="28"/>
-              </w:rPr>
-            </w:pPr>
-            <w:r>
-              <w:rPr>
-                <w:rFonts w:ascii="Times New Roman" w:hAnsi="Times New Roman" w:cs="Times New Roman"/>
-                <w:sz w:val="28"/>
-                <w:szCs w:val="28"/>
-                <w:lang w:val="ru-RU"/>
-              </w:rPr>
-              <w:t>(</w:t>
-            </w:r>
-            <w:r>
-              <w:rPr>
-                <w:rFonts w:ascii="Times New Roman" w:hAnsi="Times New Roman" w:cs="Times New Roman"/>
-                <w:sz w:val="28"/>
-                <w:szCs w:val="28"/>
+                <w:lang w:eastAsia="zh-CN"/>
+              </w:rPr>
+            </w:pPr>
+            <w:r>
+              <w:rPr>
+                <w:rFonts w:ascii="Times New Roman" w:hAnsi="Times New Roman" w:cs="Times New Roman"/>
+                <w:sz w:val="28"/>
+                <w:szCs w:val="28"/>
+                <w:lang w:eastAsia="zh-CN"/>
               </w:rPr>
               <w:t>5</w:t>
             </w:r>
-            <w:r>
-              <w:rPr>
-                <w:rFonts w:ascii="Times New Roman" w:hAnsi="Times New Roman" w:cs="Times New Roman"/>
-                <w:sz w:val="28"/>
-                <w:szCs w:val="28"/>
-              </w:rPr>
-              <w:t xml:space="preserve"> * </w:t>
-            </w:r>
-            <w:r>
-              <w:rPr>
-                <w:rFonts w:ascii="Times New Roman" w:hAnsi="Times New Roman" w:cs="Times New Roman"/>
-                <w:sz w:val="28"/>
-                <w:szCs w:val="28"/>
-              </w:rPr>
-              <w:t>5</w:t>
-            </w:r>
-            <w:r>
-              <w:rPr>
-                <w:rFonts w:ascii="Times New Roman" w:hAnsi="Times New Roman" w:cs="Times New Roman"/>
-                <w:sz w:val="28"/>
-                <w:szCs w:val="28"/>
-                <w:lang w:val="ru-RU"/>
-              </w:rPr>
-              <w:t>)</w:t>
-            </w:r>
-            <w:r>
-              <w:rPr>
-                <w:rFonts w:ascii="Times New Roman" w:hAnsi="Times New Roman" w:cs="Times New Roman"/>
-                <w:sz w:val="28"/>
-                <w:szCs w:val="28"/>
-              </w:rPr>
-              <w:t xml:space="preserve"> mod </w:t>
-            </w:r>
-            <w:r>
-              <w:rPr>
-                <w:rFonts w:ascii="Times New Roman" w:hAnsi="Times New Roman" w:cs="Times New Roman"/>
-                <w:sz w:val="28"/>
-                <w:szCs w:val="28"/>
-              </w:rPr>
-              <w:t>23</w:t>
-            </w:r>
-            <w:r>
-              <w:rPr>
-                <w:rFonts w:ascii="Times New Roman" w:hAnsi="Times New Roman" w:cs="Times New Roman"/>
-                <w:sz w:val="28"/>
-                <w:szCs w:val="28"/>
-              </w:rPr>
-              <w:t xml:space="preserve"> = </w:t>
-            </w:r>
-            <w:r>
-              <w:rPr>
-                <w:rFonts w:ascii="Times New Roman" w:hAnsi="Times New Roman" w:cs="Times New Roman"/>
-                <w:sz w:val="28"/>
-                <w:szCs w:val="28"/>
-              </w:rPr>
-              <w:t>2</w:t>
-            </w:r>
           </w:p>
         </w:tc>
         <w:tc>
@@ -497,7 +433,7 @@
                 <w:sz w:val="28"/>
                 <w:szCs w:val="28"/>
               </w:rPr>
-              <w:t>6</w:t>
+              <w:t>12</w:t>
             </w:r>
           </w:p>
         </w:tc>
@@ -511,39 +447,16 @@
                 <w:rFonts w:ascii="Times New Roman" w:hAnsi="Times New Roman" w:cs="Times New Roman"/>
                 <w:sz w:val="28"/>
                 <w:szCs w:val="28"/>
-              </w:rPr>
-            </w:pPr>
-            <w:r>
-              <w:rPr>
-                <w:rFonts w:ascii="Times New Roman" w:hAnsi="Times New Roman" w:cs="Times New Roman"/>
-                <w:sz w:val="28"/>
-                <w:szCs w:val="28"/>
-              </w:rPr>
-              <w:t>(</w:t>
-            </w:r>
-            <w:r>
-              <w:rPr>
-                <w:rFonts w:ascii="Times New Roman" w:hAnsi="Times New Roman" w:cs="Times New Roman"/>
-                <w:sz w:val="28"/>
-                <w:szCs w:val="28"/>
-              </w:rPr>
-              <w:t>1 * 5</w:t>
-            </w:r>
-            <w:r>
-              <w:rPr>
-                <w:rFonts w:ascii="Times New Roman" w:hAnsi="Times New Roman" w:cs="Times New Roman"/>
-                <w:sz w:val="28"/>
-                <w:szCs w:val="28"/>
-              </w:rPr>
-              <w:t>)</w:t>
-            </w:r>
-            <w:r>
-              <w:rPr>
-                <w:rFonts w:ascii="Times New Roman" w:hAnsi="Times New Roman" w:cs="Times New Roman"/>
-                <w:sz w:val="28"/>
-                <w:szCs w:val="28"/>
-              </w:rPr>
-              <w:t xml:space="preserve"> mod 23 = 5</w:t>
+                <w:lang w:val="ru-RU"/>
+              </w:rPr>
+            </w:pPr>
+            <w:r>
+              <w:rPr>
+                <w:rFonts w:ascii="Times New Roman" w:hAnsi="Times New Roman" w:cs="Times New Roman"/>
+                <w:sz w:val="28"/>
+                <w:szCs w:val="28"/>
+              </w:rPr>
+              <w:t>(1 * 5) mod 23 = 5</w:t>
             </w:r>
           </w:p>
         </w:tc>
@@ -590,7 +503,7 @@
                 <w:rFonts w:ascii="Times New Roman" w:hAnsi="Times New Roman" w:cs="Times New Roman"/>
                 <w:sz w:val="28"/>
                 <w:szCs w:val="28"/>
-                <w:lang w:val="ru-RU" w:eastAsia="zh-CN"/>
+                <w:lang w:val="ru-RU"/>
               </w:rPr>
               <w:t>(</w:t>
             </w:r>
@@ -599,73 +512,66 @@
                 <w:rFonts w:ascii="Times New Roman" w:hAnsi="Times New Roman" w:cs="Times New Roman"/>
                 <w:sz w:val="28"/>
                 <w:szCs w:val="28"/>
-                <w:lang w:eastAsia="zh-CN"/>
-              </w:rPr>
-              <w:t xml:space="preserve">2 </w:t>
-            </w:r>
-            <w:r>
-              <w:rPr>
-                <w:rFonts w:ascii="Times New Roman" w:hAnsi="Times New Roman" w:cs="Times New Roman"/>
-                <w:sz w:val="28"/>
-                <w:szCs w:val="28"/>
-                <w:lang w:eastAsia="zh-CN"/>
-              </w:rPr>
-              <w:t xml:space="preserve">* </w:t>
-            </w:r>
-            <w:r>
-              <w:rPr>
-                <w:rFonts w:ascii="Times New Roman" w:hAnsi="Times New Roman" w:cs="Times New Roman"/>
-                <w:sz w:val="28"/>
-                <w:szCs w:val="28"/>
-                <w:lang w:eastAsia="zh-CN"/>
+              </w:rPr>
+              <w:t>5</w:t>
+            </w:r>
+            <w:r>
+              <w:rPr>
+                <w:rFonts w:ascii="Times New Roman" w:hAnsi="Times New Roman" w:cs="Times New Roman"/>
+                <w:sz w:val="28"/>
+                <w:szCs w:val="28"/>
+              </w:rPr>
+              <w:t xml:space="preserve"> * </w:t>
+            </w:r>
+            <w:r>
+              <w:rPr>
+                <w:rFonts w:ascii="Times New Roman" w:hAnsi="Times New Roman" w:cs="Times New Roman"/>
+                <w:sz w:val="28"/>
+                <w:szCs w:val="28"/>
+              </w:rPr>
+              <w:t>5</w:t>
+            </w:r>
+            <w:r>
+              <w:rPr>
+                <w:rFonts w:ascii="Times New Roman" w:hAnsi="Times New Roman" w:cs="Times New Roman"/>
+                <w:sz w:val="28"/>
+                <w:szCs w:val="28"/>
+                <w:lang w:val="ru-RU"/>
+              </w:rPr>
+              <w:t>)</w:t>
+            </w:r>
+            <w:r>
+              <w:rPr>
+                <w:rFonts w:ascii="Times New Roman" w:hAnsi="Times New Roman" w:cs="Times New Roman"/>
+                <w:sz w:val="28"/>
+                <w:szCs w:val="28"/>
+              </w:rPr>
+              <w:t xml:space="preserve"> mod </w:t>
+            </w:r>
+            <w:r>
+              <w:rPr>
+                <w:rFonts w:ascii="Times New Roman" w:hAnsi="Times New Roman" w:cs="Times New Roman"/>
+                <w:sz w:val="28"/>
+                <w:szCs w:val="28"/>
+              </w:rPr>
+              <w:t>23</w:t>
+            </w:r>
+            <w:r>
+              <w:rPr>
+                <w:rFonts w:ascii="Times New Roman" w:hAnsi="Times New Roman" w:cs="Times New Roman"/>
+                <w:sz w:val="28"/>
+                <w:szCs w:val="28"/>
+              </w:rPr>
+              <w:t xml:space="preserve"> = </w:t>
+            </w:r>
+            <w:r>
+              <w:rPr>
+                <w:rFonts w:ascii="Times New Roman" w:hAnsi="Times New Roman" w:cs="Times New Roman"/>
+                <w:sz w:val="28"/>
+                <w:szCs w:val="28"/>
               </w:rPr>
               <w:t>2</w:t>
             </w:r>
-            <w:r>
-              <w:rPr>
-                <w:rFonts w:ascii="Times New Roman" w:hAnsi="Times New Roman" w:cs="Times New Roman"/>
-                <w:sz w:val="28"/>
-                <w:szCs w:val="28"/>
-                <w:lang w:val="ru-RU" w:eastAsia="zh-CN"/>
-              </w:rPr>
-              <w:t>)</w:t>
-            </w:r>
-            <w:r>
-              <w:rPr>
-                <w:rFonts w:ascii="Times New Roman" w:hAnsi="Times New Roman" w:cs="Times New Roman"/>
-                <w:sz w:val="28"/>
-                <w:szCs w:val="28"/>
-                <w:lang w:eastAsia="zh-CN"/>
-              </w:rPr>
-              <w:t xml:space="preserve"> mod </w:t>
-            </w:r>
-            <w:r>
-              <w:rPr>
-                <w:rFonts w:ascii="Times New Roman" w:hAnsi="Times New Roman" w:cs="Times New Roman"/>
-                <w:sz w:val="28"/>
-                <w:szCs w:val="28"/>
-                <w:lang w:eastAsia="zh-CN"/>
-              </w:rPr>
-              <w:t>23</w:t>
-            </w:r>
-            <w:r>
-              <w:rPr>
-                <w:rFonts w:ascii="Times New Roman" w:hAnsi="Times New Roman" w:cs="Times New Roman"/>
-                <w:sz w:val="28"/>
-                <w:szCs w:val="28"/>
-                <w:lang w:eastAsia="zh-CN"/>
-              </w:rPr>
-              <w:t xml:space="preserve"> = </w:t>
-            </w:r>
-            <w:r>
-              <w:rPr>
-                <w:rFonts w:ascii="Times New Roman" w:hAnsi="Times New Roman" w:cs="Times New Roman"/>
-                <w:sz w:val="28"/>
-                <w:szCs w:val="28"/>
-                <w:lang w:eastAsia="zh-CN"/>
-              </w:rPr>
-              <w:t>4</w:t>
-            </w:r>
           </w:p>
         </w:tc>
         <w:tc>
@@ -686,7 +592,7 @@
                 <w:sz w:val="28"/>
                 <w:szCs w:val="28"/>
               </w:rPr>
-              <w:t>3</w:t>
+              <w:t>6</w:t>
             </w:r>
           </w:p>
         </w:tc>
@@ -709,15 +615,7 @@
                 <w:sz w:val="28"/>
                 <w:szCs w:val="28"/>
               </w:rPr>
-              <w:t>5</w:t>
-            </w:r>
-            <w:r>
-              <w:rPr>
-                <w:rFonts w:ascii="Times New Roman" w:hAnsi="Times New Roman" w:cs="Times New Roman"/>
-                <w:sz w:val="28"/>
-                <w:szCs w:val="28"/>
-              </w:rPr>
-              <w:t xml:space="preserve"> (6 – </w:t>
+              <w:t xml:space="preserve">5 (12 – </w:t>
             </w:r>
             <w:r>
               <w:rPr>
@@ -784,80 +682,71 @@
                 <w:szCs w:val="28"/>
                 <w:lang w:eastAsia="zh-CN"/>
               </w:rPr>
+              <w:t xml:space="preserve">2 </w:t>
+            </w:r>
+            <w:r>
+              <w:rPr>
+                <w:rFonts w:ascii="Times New Roman" w:hAnsi="Times New Roman" w:cs="Times New Roman"/>
+                <w:sz w:val="28"/>
+                <w:szCs w:val="28"/>
+                <w:lang w:eastAsia="zh-CN"/>
+              </w:rPr>
+              <w:t xml:space="preserve">* </w:t>
+            </w:r>
+            <w:r>
+              <w:rPr>
+                <w:rFonts w:ascii="Times New Roman" w:hAnsi="Times New Roman" w:cs="Times New Roman"/>
+                <w:sz w:val="28"/>
+                <w:szCs w:val="28"/>
+                <w:lang w:eastAsia="zh-CN"/>
+              </w:rPr>
+              <w:t>2</w:t>
+            </w:r>
+            <w:r>
+              <w:rPr>
+                <w:rFonts w:ascii="Times New Roman" w:hAnsi="Times New Roman" w:cs="Times New Roman"/>
+                <w:sz w:val="28"/>
+                <w:szCs w:val="28"/>
+                <w:lang w:val="ru-RU" w:eastAsia="zh-CN"/>
+              </w:rPr>
+              <w:t>)</w:t>
+            </w:r>
+            <w:r>
+              <w:rPr>
+                <w:rFonts w:ascii="Times New Roman" w:hAnsi="Times New Roman" w:cs="Times New Roman"/>
+                <w:sz w:val="28"/>
+                <w:szCs w:val="28"/>
+                <w:lang w:eastAsia="zh-CN"/>
+              </w:rPr>
+              <w:t xml:space="preserve"> mod </w:t>
+            </w:r>
+            <w:r>
+              <w:rPr>
+                <w:rFonts w:ascii="Times New Roman" w:hAnsi="Times New Roman" w:cs="Times New Roman"/>
+                <w:sz w:val="28"/>
+                <w:szCs w:val="28"/>
+                <w:lang w:eastAsia="zh-CN"/>
+              </w:rPr>
+              <w:t>23</w:t>
+            </w:r>
+            <w:r>
+              <w:rPr>
+                <w:rFonts w:ascii="Times New Roman" w:hAnsi="Times New Roman" w:cs="Times New Roman"/>
+                <w:sz w:val="28"/>
+                <w:szCs w:val="28"/>
+                <w:lang w:eastAsia="zh-CN"/>
+              </w:rPr>
+              <w:t xml:space="preserve"> = </w:t>
+            </w:r>
+            <w:r>
+              <w:rPr>
+                <w:rFonts w:ascii="Times New Roman" w:hAnsi="Times New Roman" w:cs="Times New Roman"/>
+                <w:sz w:val="28"/>
+                <w:szCs w:val="28"/>
+                <w:lang w:eastAsia="zh-CN"/>
+              </w:rPr>
               <w:t>4</w:t>
             </w:r>
-            <w:r>
-              <w:rPr>
-                <w:rFonts w:ascii="Times New Roman" w:hAnsi="Times New Roman" w:cs="Times New Roman"/>
-                <w:sz w:val="28"/>
-                <w:szCs w:val="28"/>
-                <w:lang w:eastAsia="zh-CN"/>
-              </w:rPr>
-              <w:t xml:space="preserve"> * </w:t>
-            </w:r>
-            <w:r>
-              <w:rPr>
-                <w:rFonts w:ascii="Times New Roman" w:hAnsi="Times New Roman" w:cs="Times New Roman"/>
-                <w:sz w:val="28"/>
-                <w:szCs w:val="28"/>
-                <w:lang w:eastAsia="zh-CN"/>
-              </w:rPr>
-              <w:t>4</w:t>
-            </w:r>
-            <w:r>
-              <w:rPr>
-                <w:rFonts w:ascii="Times New Roman" w:hAnsi="Times New Roman" w:cs="Times New Roman"/>
-                <w:sz w:val="28"/>
-                <w:szCs w:val="28"/>
-                <w:lang w:val="ru-RU" w:eastAsia="zh-CN"/>
-              </w:rPr>
-              <w:t>)</w:t>
-            </w:r>
-            <w:r>
-              <w:rPr>
-                <w:rFonts w:ascii="Times New Roman" w:hAnsi="Times New Roman" w:cs="Times New Roman"/>
-                <w:sz w:val="28"/>
-                <w:szCs w:val="28"/>
-                <w:lang w:eastAsia="zh-CN"/>
-              </w:rPr>
-              <w:t xml:space="preserve"> mod </w:t>
-            </w:r>
-            <w:r>
-              <w:rPr>
-                <w:rFonts w:ascii="Times New Roman" w:hAnsi="Times New Roman" w:cs="Times New Roman"/>
-                <w:sz w:val="28"/>
-                <w:szCs w:val="28"/>
-                <w:lang w:eastAsia="zh-CN"/>
-              </w:rPr>
-              <w:t>23</w:t>
-            </w:r>
-            <w:r>
-              <w:rPr>
-                <w:rFonts w:ascii="Times New Roman" w:hAnsi="Times New Roman" w:cs="Times New Roman"/>
-                <w:sz w:val="28"/>
-                <w:szCs w:val="28"/>
-                <w:lang w:eastAsia="zh-CN"/>
-              </w:rPr>
-              <w:t xml:space="preserve"> = </w:t>
-            </w:r>
-            <w:r>
-              <w:rPr>
-                <w:rFonts w:ascii="Times New Roman" w:hAnsi="Times New Roman" w:cs="Times New Roman"/>
-                <w:sz w:val="28"/>
-                <w:szCs w:val="28"/>
-                <w:lang w:eastAsia="zh-CN"/>
-              </w:rPr>
-              <w:t>1</w:t>
-            </w:r>
-            <w:r>
-              <w:rPr>
-                <w:rFonts w:ascii="Times New Roman" w:hAnsi="Times New Roman" w:cs="Times New Roman"/>
-                <w:sz w:val="28"/>
-                <w:szCs w:val="28"/>
-                <w:lang w:eastAsia="zh-CN"/>
-              </w:rPr>
-              <w:t>6</w:t>
-            </w:r>
           </w:p>
         </w:tc>
         <w:tc>
@@ -870,17 +759,15 @@
                 <w:rFonts w:ascii="Times New Roman" w:hAnsi="Times New Roman" w:cs="Times New Roman"/>
                 <w:sz w:val="28"/>
                 <w:szCs w:val="28"/>
-                <w:lang w:val="ru-RU"/>
-              </w:rPr>
-            </w:pPr>
-            <w:r>
-              <w:rPr>
-                <w:rFonts w:ascii="Times New Roman" w:hAnsi="Times New Roman" w:cs="Times New Roman"/>
-                <w:sz w:val="28"/>
-                <w:szCs w:val="28"/>
-                <w:lang w:val="ru-RU"/>
-              </w:rPr>
-              <w:t>1</w:t>
+              </w:rPr>
+            </w:pPr>
+            <w:r>
+              <w:rPr>
+                <w:rFonts w:ascii="Times New Roman" w:hAnsi="Times New Roman" w:cs="Times New Roman"/>
+                <w:sz w:val="28"/>
+                <w:szCs w:val="28"/>
+              </w:rPr>
+              <w:t>3</w:t>
             </w:r>
           </w:p>
         </w:tc>
@@ -894,17 +781,9 @@
                 <w:rFonts w:ascii="Times New Roman" w:hAnsi="Times New Roman" w:cs="Times New Roman"/>
                 <w:sz w:val="28"/>
                 <w:szCs w:val="28"/>
-              </w:rPr>
-            </w:pPr>
-            <w:r>
-              <w:rPr>
-                <w:rFonts w:ascii="Times New Roman" w:hAnsi="Times New Roman" w:cs="Times New Roman"/>
-                <w:sz w:val="28"/>
-                <w:szCs w:val="28"/>
-                <w:lang w:val="ru-RU"/>
-              </w:rPr>
-              <w:t>(</w:t>
-            </w:r>
+                <w:lang w:val="ru-RU"/>
+              </w:rPr>
+            </w:pPr>
             <w:r>
               <w:rPr>
                 <w:rFonts w:ascii="Times New Roman" w:hAnsi="Times New Roman" w:cs="Times New Roman"/>
@@ -919,56 +798,16 @@
                 <w:sz w:val="28"/>
                 <w:szCs w:val="28"/>
               </w:rPr>
-              <w:t xml:space="preserve"> * </w:t>
-            </w:r>
-            <w:r>
-              <w:rPr>
-                <w:rFonts w:ascii="Times New Roman" w:hAnsi="Times New Roman" w:cs="Times New Roman"/>
-                <w:sz w:val="28"/>
-                <w:szCs w:val="28"/>
-              </w:rPr>
-              <w:t>4</w:t>
-            </w:r>
-            <w:r>
-              <w:rPr>
-                <w:rFonts w:ascii="Times New Roman" w:hAnsi="Times New Roman" w:cs="Times New Roman"/>
-                <w:sz w:val="28"/>
-                <w:szCs w:val="28"/>
-                <w:lang w:val="ru-RU"/>
-              </w:rPr>
-              <w:t>)</w:t>
-            </w:r>
-            <w:r>
-              <w:rPr>
-                <w:rFonts w:ascii="Times New Roman" w:hAnsi="Times New Roman" w:cs="Times New Roman"/>
-                <w:sz w:val="28"/>
-                <w:szCs w:val="28"/>
-              </w:rPr>
-              <w:t xml:space="preserve"> mod </w:t>
-            </w:r>
-            <w:r>
-              <w:rPr>
-                <w:rFonts w:ascii="Times New Roman" w:hAnsi="Times New Roman" w:cs="Times New Roman"/>
-                <w:sz w:val="28"/>
-                <w:szCs w:val="28"/>
-              </w:rPr>
-              <w:t>23</w:t>
-            </w:r>
-            <w:r>
-              <w:rPr>
-                <w:rFonts w:ascii="Times New Roman" w:hAnsi="Times New Roman" w:cs="Times New Roman"/>
-                <w:sz w:val="28"/>
-                <w:szCs w:val="28"/>
-              </w:rPr>
-              <w:t xml:space="preserve"> = </w:t>
-            </w:r>
-            <w:r>
-              <w:rPr>
-                <w:rFonts w:ascii="Times New Roman" w:hAnsi="Times New Roman" w:cs="Times New Roman"/>
-                <w:sz w:val="28"/>
-                <w:szCs w:val="28"/>
-              </w:rPr>
-              <w:t>20</w:t>
+              <w:t xml:space="preserve"> (6 – </w:t>
+            </w:r>
+            <w:r>
+              <w:rPr>
+                <w:rFonts w:ascii="Times New Roman" w:hAnsi="Times New Roman" w:cs="Times New Roman"/>
+                <w:sz w:val="28"/>
+                <w:szCs w:val="28"/>
+                <w:lang w:val="ru-RU"/>
+              </w:rPr>
+              <w:t>четное)</w:t>
             </w:r>
           </w:p>
         </w:tc>
@@ -1008,9 +847,220 @@
                 <w:rFonts w:ascii="Times New Roman" w:hAnsi="Times New Roman" w:cs="Times New Roman"/>
                 <w:sz w:val="28"/>
                 <w:szCs w:val="28"/>
+                <w:lang w:val="ru-RU" w:eastAsia="zh-CN"/>
+              </w:rPr>
+            </w:pPr>
+            <w:r>
+              <w:rPr>
+                <w:rFonts w:ascii="Times New Roman" w:hAnsi="Times New Roman" w:cs="Times New Roman"/>
+                <w:sz w:val="28"/>
+                <w:szCs w:val="28"/>
+                <w:lang w:val="ru-RU" w:eastAsia="zh-CN"/>
+              </w:rPr>
+              <w:t>4</w:t>
+            </w:r>
+          </w:p>
+        </w:tc>
+        <w:tc>
+          <w:tcPr>
+            <w:tcW w:w="1530" w:type="dxa"/>
+          </w:tcPr>
+          <w:p>
+            <w:pPr>
+              <w:rPr>
+                <w:rFonts w:ascii="Times New Roman" w:hAnsi="Times New Roman" w:cs="Times New Roman"/>
+                <w:sz w:val="28"/>
+                <w:szCs w:val="28"/>
+                <w:lang w:val="ru-RU"/>
+              </w:rPr>
+            </w:pPr>
+            <w:r>
+              <w:rPr>
+                <w:rFonts w:ascii="Times New Roman" w:hAnsi="Times New Roman" w:cs="Times New Roman"/>
+                <w:sz w:val="28"/>
+                <w:szCs w:val="28"/>
+                <w:lang w:val="ru-RU"/>
+              </w:rPr>
+              <w:t>2</w:t>
+            </w:r>
+          </w:p>
+        </w:tc>
+        <w:tc>
+          <w:tcPr>
+            <w:tcW w:w="2970" w:type="dxa"/>
+          </w:tcPr>
+          <w:p>
+            <w:pPr>
+              <w:rPr>
+                <w:rFonts w:ascii="Times New Roman" w:hAnsi="Times New Roman" w:cs="Times New Roman"/>
+                <w:sz w:val="28"/>
+                <w:szCs w:val="28"/>
+              </w:rPr>
+            </w:pPr>
+            <w:r>
+              <w:rPr>
+                <w:rFonts w:ascii="Times New Roman" w:hAnsi="Times New Roman" w:cs="Times New Roman"/>
+                <w:sz w:val="28"/>
+                <w:szCs w:val="28"/>
+                <w:lang w:val="ru-RU"/>
+              </w:rPr>
+              <w:t>(</w:t>
+            </w:r>
+            <w:r>
+              <w:rPr>
+                <w:rFonts w:ascii="Times New Roman" w:hAnsi="Times New Roman" w:cs="Times New Roman"/>
+                <w:sz w:val="28"/>
+                <w:szCs w:val="28"/>
+              </w:rPr>
+              <w:t>5 * 4</w:t>
+            </w:r>
+            <w:r>
+              <w:rPr>
+                <w:rFonts w:ascii="Times New Roman" w:hAnsi="Times New Roman" w:cs="Times New Roman"/>
+                <w:sz w:val="28"/>
+                <w:szCs w:val="28"/>
+                <w:lang w:val="ru-RU"/>
+              </w:rPr>
+              <w:t>)</w:t>
+            </w:r>
+            <w:r>
+              <w:rPr>
+                <w:rFonts w:ascii="Times New Roman" w:hAnsi="Times New Roman" w:cs="Times New Roman"/>
+                <w:sz w:val="28"/>
+                <w:szCs w:val="28"/>
+              </w:rPr>
+              <w:t xml:space="preserve"> mod 23 = 20</w:t>
+            </w:r>
+          </w:p>
+        </w:tc>
+        <w:tc>
+          <w:tcPr>
+            <w:tcW w:w="1669" w:type="dxa"/>
+          </w:tcPr>
+          <w:p>
+            <w:pPr>
+              <w:rPr>
+                <w:rFonts w:ascii="Times New Roman" w:hAnsi="Times New Roman" w:cs="Times New Roman"/>
+                <w:sz w:val="28"/>
+                <w:szCs w:val="28"/>
+                <w:lang w:val="ru-RU"/>
+              </w:rPr>
+            </w:pPr>
+            <w:r>
+              <w:rPr>
+                <w:rFonts w:ascii="Times New Roman" w:hAnsi="Times New Roman" w:cs="Times New Roman"/>
+                <w:sz w:val="28"/>
+                <w:szCs w:val="28"/>
+                <w:lang w:val="ru-RU"/>
+              </w:rPr>
+              <w:t>4</w:t>
+            </w:r>
+          </w:p>
+        </w:tc>
+      </w:tr>
+      <w:tr>
+        <w:tc>
+          <w:tcPr>
+            <w:tcW w:w="2785" w:type="dxa"/>
+          </w:tcPr>
+          <w:p>
+            <w:pPr>
+              <w:rPr>
+                <w:rFonts w:ascii="Times New Roman" w:hAnsi="Times New Roman" w:cs="Times New Roman"/>
+                <w:sz w:val="28"/>
+                <w:szCs w:val="28"/>
+              </w:rPr>
+            </w:pPr>
+            <w:r>
+              <w:rPr>
+                <w:rFonts w:ascii="Times New Roman" w:hAnsi="Times New Roman" w:cs="Times New Roman"/>
+                <w:sz w:val="28"/>
+                <w:szCs w:val="28"/>
+                <w:lang w:val="ru-RU" w:eastAsia="zh-CN"/>
+              </w:rPr>
+              <w:t>(</w:t>
+            </w:r>
+            <w:r>
+              <w:rPr>
+                <w:rFonts w:ascii="Times New Roman" w:hAnsi="Times New Roman" w:cs="Times New Roman"/>
+                <w:sz w:val="28"/>
+                <w:szCs w:val="28"/>
                 <w:lang w:eastAsia="zh-CN"/>
               </w:rPr>
-            </w:pPr>
+              <w:t>4</w:t>
+            </w:r>
+            <w:r>
+              <w:rPr>
+                <w:rFonts w:ascii="Times New Roman" w:hAnsi="Times New Roman" w:cs="Times New Roman"/>
+                <w:sz w:val="28"/>
+                <w:szCs w:val="28"/>
+                <w:lang w:eastAsia="zh-CN"/>
+              </w:rPr>
+              <w:t xml:space="preserve"> * </w:t>
+            </w:r>
+            <w:r>
+              <w:rPr>
+                <w:rFonts w:ascii="Times New Roman" w:hAnsi="Times New Roman" w:cs="Times New Roman"/>
+                <w:sz w:val="28"/>
+                <w:szCs w:val="28"/>
+                <w:lang w:eastAsia="zh-CN"/>
+              </w:rPr>
+              <w:t>4</w:t>
+            </w:r>
+            <w:r>
+              <w:rPr>
+                <w:rFonts w:ascii="Times New Roman" w:hAnsi="Times New Roman" w:cs="Times New Roman"/>
+                <w:sz w:val="28"/>
+                <w:szCs w:val="28"/>
+                <w:lang w:val="ru-RU" w:eastAsia="zh-CN"/>
+              </w:rPr>
+              <w:t>)</w:t>
+            </w:r>
+            <w:r>
+              <w:rPr>
+                <w:rFonts w:ascii="Times New Roman" w:hAnsi="Times New Roman" w:cs="Times New Roman"/>
+                <w:sz w:val="28"/>
+                <w:szCs w:val="28"/>
+                <w:lang w:eastAsia="zh-CN"/>
+              </w:rPr>
+              <w:t xml:space="preserve"> mod </w:t>
+            </w:r>
+            <w:r>
+              <w:rPr>
+                <w:rFonts w:ascii="Times New Roman" w:hAnsi="Times New Roman" w:cs="Times New Roman"/>
+                <w:sz w:val="28"/>
+                <w:szCs w:val="28"/>
+                <w:lang w:eastAsia="zh-CN"/>
+              </w:rPr>
+              <w:t>23</w:t>
+            </w:r>
+            <w:r>
+              <w:rPr>
+                <w:rFonts w:ascii="Times New Roman" w:hAnsi="Times New Roman" w:cs="Times New Roman"/>
+                <w:sz w:val="28"/>
+                <w:szCs w:val="28"/>
+                <w:lang w:eastAsia="zh-CN"/>
+              </w:rPr>
+              <w:t xml:space="preserve"> = </w:t>
+            </w:r>
+            <w:r>
+              <w:rPr>
+                <w:rFonts w:ascii="Times New Roman" w:hAnsi="Times New Roman" w:cs="Times New Roman"/>
+                <w:sz w:val="28"/>
+                <w:szCs w:val="28"/>
+                <w:lang w:eastAsia="zh-CN"/>
+              </w:rPr>
+              <w:t>1</w:t>
+            </w:r>
+            <w:r>
+              <w:rPr>
+                <w:rFonts w:ascii="Times New Roman" w:hAnsi="Times New Roman" w:cs="Times New Roman"/>
+                <w:sz w:val="28"/>
+                <w:szCs w:val="28"/>
+                <w:lang w:eastAsia="zh-CN"/>
+              </w:rPr>
+              <w:t>6</w:t>
+            </w:r>
           </w:p>
         </w:tc>
         <w:tc>
@@ -1023,6 +1073,95 @@
                 <w:rFonts w:ascii="Times New Roman" w:hAnsi="Times New Roman" w:cs="Times New Roman"/>
                 <w:sz w:val="28"/>
                 <w:szCs w:val="28"/>
+                <w:lang w:val="ru-RU"/>
+              </w:rPr>
+            </w:pPr>
+            <w:r>
+              <w:rPr>
+                <w:rFonts w:ascii="Times New Roman" w:hAnsi="Times New Roman" w:cs="Times New Roman"/>
+                <w:sz w:val="28"/>
+                <w:szCs w:val="28"/>
+                <w:lang w:val="ru-RU"/>
+              </w:rPr>
+              <w:t>1</w:t>
+            </w:r>
+          </w:p>
+        </w:tc>
+        <w:tc>
+          <w:tcPr>
+            <w:tcW w:w="2970" w:type="dxa"/>
+          </w:tcPr>
+          <w:p>
+            <w:pPr>
+              <w:rPr>
+                <w:rFonts w:ascii="Times New Roman" w:hAnsi="Times New Roman" w:cs="Times New Roman"/>
+                <w:sz w:val="28"/>
+                <w:szCs w:val="28"/>
+                <w:lang w:val="ru-RU"/>
+              </w:rPr>
+            </w:pPr>
+            <w:r>
+              <w:rPr>
+                <w:rFonts w:ascii="Times New Roman" w:hAnsi="Times New Roman" w:cs="Times New Roman"/>
+                <w:sz w:val="28"/>
+                <w:szCs w:val="28"/>
+                <w:lang w:val="ru-RU"/>
+              </w:rPr>
+              <w:t>20 (2 – четное)</w:t>
+            </w:r>
+          </w:p>
+        </w:tc>
+        <w:tc>
+          <w:tcPr>
+            <w:tcW w:w="1669" w:type="dxa"/>
+          </w:tcPr>
+          <w:p>
+            <w:pPr>
+              <w:rPr>
+                <w:rFonts w:ascii="Times New Roman" w:hAnsi="Times New Roman" w:cs="Times New Roman"/>
+                <w:sz w:val="28"/>
+                <w:szCs w:val="28"/>
+                <w:lang w:val="ru-RU"/>
+              </w:rPr>
+            </w:pPr>
+            <w:r>
+              <w:rPr>
+                <w:rFonts w:ascii="Times New Roman" w:hAnsi="Times New Roman" w:cs="Times New Roman"/>
+                <w:sz w:val="28"/>
+                <w:szCs w:val="28"/>
+                <w:lang w:val="ru-RU"/>
+              </w:rPr>
+              <w:t>5</w:t>
+            </w:r>
+          </w:p>
+        </w:tc>
+      </w:tr>
+      <w:tr>
+        <w:tc>
+          <w:tcPr>
+            <w:tcW w:w="2785" w:type="dxa"/>
+          </w:tcPr>
+          <w:p>
+            <w:pPr>
+              <w:rPr>
+                <w:rFonts w:ascii="Times New Roman" w:hAnsi="Times New Roman" w:cs="Times New Roman"/>
+                <w:sz w:val="28"/>
+                <w:szCs w:val="28"/>
+                <w:lang w:eastAsia="zh-CN"/>
+              </w:rPr>
+            </w:pPr>
+          </w:p>
+        </w:tc>
+        <w:tc>
+          <w:tcPr>
+            <w:tcW w:w="1530" w:type="dxa"/>
+          </w:tcPr>
+          <w:p>
+            <w:pPr>
+              <w:rPr>
+                <w:rFonts w:ascii="Times New Roman" w:hAnsi="Times New Roman" w:cs="Times New Roman"/>
+                <w:sz w:val="28"/>
+                <w:szCs w:val="28"/>
               </w:rPr>
             </w:pPr>
             <w:r>
@@ -1093,15 +1232,17 @@
                 <w:rFonts w:ascii="Times New Roman" w:hAnsi="Times New Roman" w:cs="Times New Roman"/>
                 <w:sz w:val="28"/>
                 <w:szCs w:val="28"/>
-              </w:rPr>
-            </w:pPr>
-            <w:r>
-              <w:rPr>
-                <w:rFonts w:ascii="Times New Roman" w:hAnsi="Times New Roman" w:cs="Times New Roman"/>
-                <w:sz w:val="28"/>
-                <w:szCs w:val="28"/>
-              </w:rPr>
-              <w:t>4</w:t>
+                <w:lang w:val="ru-RU"/>
+              </w:rPr>
+            </w:pPr>
+            <w:r>
+              <w:rPr>
+                <w:rFonts w:ascii="Times New Roman" w:hAnsi="Times New Roman" w:cs="Times New Roman"/>
+                <w:sz w:val="28"/>
+                <w:szCs w:val="28"/>
+                <w:lang w:val="ru-RU"/>
+              </w:rPr>
+              <w:t>6</w:t>
             </w:r>
           </w:p>
         </w:tc>
@@ -2425,8 +2566,6 @@
         </w:rPr>
         <w:t>первообразные корни</w:t>
       </w:r>
-      <w:bookmarkStart w:id="0" w:name="_GoBack"/>
-      <w:bookmarkEnd w:id="0"/>
     </w:p>
     <w:p>
       <w:pPr>
@@ -4074,16 +4213,8 @@
         </w:rPr>
         <w:t>17 * (-5) + 43 * 2 = -85 + 86 = 1</w:t>
       </w:r>
-    </w:p>
-    <w:p>
-      <w:pPr>
-        <w:rPr>
-          <w:rFonts w:ascii="Times New Roman" w:hAnsi="Times New Roman" w:cs="Times New Roman"/>
-          <w:sz w:val="28"/>
-          <w:szCs w:val="28"/>
-          <w:lang w:val="ru-RU"/>
-        </w:rPr>
-      </w:pPr>
+      <w:bookmarkStart w:id="0" w:name="_GoBack"/>
+      <w:bookmarkEnd w:id="0"/>
     </w:p>
     <w:sectPr>
       <w:pgSz w:w="11906" w:h="16838"/>

</xml_diff>